<commit_message>
Adiciona estrutura do board interno (CoE/Tradicional/Agêntica) e remove caractere §
Cria estrutura-jira-interna-fabrica.md com tipos de item, swimlanes por programa,
12 campos customizados com propósito, padrões de escrita e backlog (épicos/US/
enablers/spikes/tasks) dos 4 programas. Substitui § por "seção" em todos os
artefatos e re-renderiza os PDFs.

https://claude.ai/code/session_01VN41cp61dZaxP723fGoe9F
</commit_message>
<xml_diff>
--- a/sysmap-fabric/spec-jira-sysmap-fabric-v1.2.docx
+++ b/sysmap-fabric/spec-jira-sysmap-fabric-v1.2.docx
@@ -13947,7 +13947,7 @@
           <w:color w:val="D97706"/>
           <w:sz w:val="20"/>
         </w:rPr>
-        <w:t>⚠ A DEFINIR: Alerta de bug crítico (GUT ≥ 27) — configurar automação no Jira (Project → Automation): ao criar Bug com Criticidade GUT = Crítico, enviar e-mail ao Responsável (DM do projeto) + Ana Lima e, se disponível, postar no canal Teams/Slack #bugs-criticos. Sem isso, o prazo de 2h da §4.5 fica sem garantia.</w:t>
+        <w:t>⚠ A DEFINIR: Alerta de bug crítico (GUT ≥ 27) — configurar automação no Jira (Project → Automation): ao criar Bug com Criticidade GUT = Crítico, enviar e-mail ao Responsável (DM do projeto) + Ana Lima e, se disponível, postar no canal Teams/Slack #bugs-criticos. Sem isso, o prazo de 2h da seção 4.5 fica sem garantia.</w:t>
       </w:r>
     </w:p>
     <w:p>
@@ -28965,7 +28965,7 @@
                 <w:sz w:val="17"/>
                 <w:szCs w:val="17"/>
               </w:rPr>
-              <w:t>✅ Resolvido — kit-gov v1.0 §5</w:t>
+              <w:t>✅ Resolvido — kit-gov v1.0 seção 5</w:t>
             </w:r>
           </w:p>
         </w:tc>
@@ -29157,7 +29157,7 @@
                 <w:sz w:val="17"/>
                 <w:szCs w:val="17"/>
               </w:rPr>
-              <w:t>🟡 Parcial — board-admin §2 + kit-gov §4</w:t>
+              <w:t>🟡 Parcial — board-admin seção 2 + kit-gov seção 4</w:t>
             </w:r>
           </w:p>
         </w:tc>

</xml_diff>